<commit_message>
fix(web): raise scan proxy timeout to 620s for 200-symbol batches
perf(risk): tighten alpha-v2 stop/widen TP per 2026-06 intraday MAE backtest (stop=1.5xATR, tp=5xATR, 0.40R vs 0.29R)

add short-interest/catalyst research scripts + exclude them from ruff (standalone offline scripts)
</commit_message>
<xml_diff>
--- a/FinPilot_Scanner_Backtest_Raporu.docx
+++ b/FinPilot_Scanner_Backtest_Raporu.docx
@@ -16999,6 +16999,1007 @@
           <w:sz w:val="20"/>
         </w:rPr>
         <w:t>Uygulama: degisiklikleri env-gate arkasinda kademeli ac (squeeze zaten oyle), 2 hafta paper trading ile realized lift'i es-zamanli baz orana gore dogrula, sonra kucuk pozisyon.</w:t>
+      </w:r>
+    </w:p>
+    <w:p>
+      <w:r>
+        <w:br w:type="page"/>
+      </w:r>
+    </w:p>
+    <w:p>
+      <w:pPr>
+        <w:spacing w:before="200" w:after="80"/>
+      </w:pPr>
+      <w:r>
+        <w:rPr>
+          <w:b/>
+          <w:color w:val="1F3864"/>
+          <w:sz w:val="40"/>
+        </w:rPr>
+        <w:t>18. Sonraki Veri Onceligi: Intraday Stop + SEC Catalyst + Tarihsel Short</w:t>
+      </w:r>
+    </w:p>
+    <w:p>
+      <w:pPr>
+        <w:spacing w:before="200" w:after="80"/>
+      </w:pPr>
+      <w:r>
+        <w:rPr>
+          <w:b/>
+          <w:color w:val="C0392A"/>
+          <w:sz w:val="23"/>
+        </w:rPr>
+        <w:t>18.1 Intraday stop testi — onceki TP kararini DUZELTTI</w:t>
+      </w:r>
+    </w:p>
+    <w:p>
+      <w:pPr>
+        <w:spacing w:after="120"/>
+      </w:pPr>
+      <w:r>
+        <w:rPr>
+          <w:b w:val="0"/>
+          <w:i w:val="0"/>
+          <w:sz w:val="21"/>
+        </w:rPr>
+        <w:t>Alpaca 15-dk barlariyla gercek stop-out simulasyonu (800 sinyal). MAE medyani 0.97R (sinyaller cogu ~1R geri cekiliyor). Stop x TP grid beklentisi (R):</w:t>
+      </w:r>
+    </w:p>
+    <w:tbl>
+      <w:tblPr>
+        <w:tblStyle w:val="TableGrid"/>
+        <w:tblW w:type="auto" w:w="0"/>
+        <w:jc w:val="center"/>
+        <w:tblLook w:firstColumn="1" w:firstRow="1" w:lastColumn="0" w:lastRow="0" w:noHBand="0" w:noVBand="1" w:val="04A0"/>
+      </w:tblPr>
+      <w:tblGrid>
+        <w:gridCol w:w="1728"/>
+        <w:gridCol w:w="1728"/>
+        <w:gridCol w:w="1728"/>
+        <w:gridCol w:w="1728"/>
+        <w:gridCol w:w="1728"/>
+      </w:tblGrid>
+      <w:tr>
+        <w:tc>
+          <w:tcPr>
+            <w:tcW w:type="dxa" w:w="1440"/>
+            <w:shd w:val="clear" w:fill="2E75B6"/>
+          </w:tcPr>
+          <w:p>
+            <w:r/>
+            <w:r>
+              <w:rPr>
+                <w:b/>
+                <w:color w:val="FFFFFF"/>
+                <w:sz w:val="18"/>
+              </w:rPr>
+              <w:t>Stop</w:t>
+            </w:r>
+          </w:p>
+        </w:tc>
+        <w:tc>
+          <w:tcPr>
+            <w:tcW w:type="dxa" w:w="1440"/>
+            <w:shd w:val="clear" w:fill="2E75B6"/>
+          </w:tcPr>
+          <w:p>
+            <w:r/>
+            <w:r>
+              <w:rPr>
+                <w:b/>
+                <w:color w:val="FFFFFF"/>
+                <w:sz w:val="18"/>
+              </w:rPr>
+              <w:t>TP</w:t>
+            </w:r>
+          </w:p>
+        </w:tc>
+        <w:tc>
+          <w:tcPr>
+            <w:tcW w:type="dxa" w:w="1584"/>
+            <w:shd w:val="clear" w:fill="2E75B6"/>
+          </w:tcPr>
+          <w:p>
+            <w:r/>
+            <w:r>
+              <w:rPr>
+                <w:b/>
+                <w:color w:val="FFFFFF"/>
+                <w:sz w:val="18"/>
+              </w:rPr>
+              <w:t>Win%</w:t>
+            </w:r>
+          </w:p>
+        </w:tc>
+        <w:tc>
+          <w:tcPr>
+            <w:tcW w:type="dxa" w:w="2304"/>
+            <w:shd w:val="clear" w:fill="2E75B6"/>
+          </w:tcPr>
+          <w:p>
+            <w:r/>
+            <w:r>
+              <w:rPr>
+                <w:b/>
+                <w:color w:val="FFFFFF"/>
+                <w:sz w:val="18"/>
+              </w:rPr>
+              <w:t>Beklenti (R)</w:t>
+            </w:r>
+          </w:p>
+        </w:tc>
+        <w:tc>
+          <w:tcPr>
+            <w:tcW w:type="dxa" w:w="1440"/>
+            <w:shd w:val="clear" w:fill="2E75B6"/>
+          </w:tcPr>
+          <w:p>
+            <w:r/>
+            <w:r>
+              <w:rPr>
+                <w:b/>
+                <w:color w:val="FFFFFF"/>
+                <w:sz w:val="18"/>
+              </w:rPr>
+              <w:t>PF</w:t>
+            </w:r>
+          </w:p>
+        </w:tc>
+      </w:tr>
+      <w:tr>
+        <w:tc>
+          <w:tcPr>
+            <w:tcW w:type="dxa" w:w="1440"/>
+          </w:tcPr>
+          <w:p>
+            <w:r/>
+            <w:r>
+              <w:rPr>
+                <w:sz w:val="17"/>
+              </w:rPr>
+              <w:t>1.0x</w:t>
+            </w:r>
+          </w:p>
+        </w:tc>
+        <w:tc>
+          <w:tcPr>
+            <w:tcW w:type="dxa" w:w="1440"/>
+          </w:tcPr>
+          <w:p>
+            <w:r/>
+            <w:r>
+              <w:rPr>
+                <w:sz w:val="17"/>
+              </w:rPr>
+              <w:t>5.0x</w:t>
+            </w:r>
+          </w:p>
+        </w:tc>
+        <w:tc>
+          <w:tcPr>
+            <w:tcW w:type="dxa" w:w="1584"/>
+          </w:tcPr>
+          <w:p>
+            <w:r/>
+            <w:r>
+              <w:rPr>
+                <w:sz w:val="17"/>
+              </w:rPr>
+              <w:t>46%</w:t>
+            </w:r>
+          </w:p>
+        </w:tc>
+        <w:tc>
+          <w:tcPr>
+            <w:tcW w:type="dxa" w:w="2304"/>
+          </w:tcPr>
+          <w:p>
+            <w:r/>
+            <w:r>
+              <w:rPr>
+                <w:sz w:val="17"/>
+              </w:rPr>
+              <w:t>0.44</w:t>
+            </w:r>
+          </w:p>
+        </w:tc>
+        <w:tc>
+          <w:tcPr>
+            <w:tcW w:type="dxa" w:w="1440"/>
+          </w:tcPr>
+          <w:p>
+            <w:r/>
+            <w:r>
+              <w:rPr>
+                <w:sz w:val="17"/>
+              </w:rPr>
+              <w:t>1.87</w:t>
+            </w:r>
+          </w:p>
+        </w:tc>
+      </w:tr>
+      <w:tr>
+        <w:tc>
+          <w:tcPr>
+            <w:tcW w:type="dxa" w:w="1440"/>
+            <w:shd w:val="clear" w:fill="EEF3FA"/>
+          </w:tcPr>
+          <w:p>
+            <w:r/>
+            <w:r>
+              <w:rPr>
+                <w:b/>
+                <w:color w:val="2E9E5B"/>
+                <w:sz w:val="17"/>
+              </w:rPr>
+              <w:t>1.5x</w:t>
+            </w:r>
+          </w:p>
+        </w:tc>
+        <w:tc>
+          <w:tcPr>
+            <w:tcW w:type="dxa" w:w="1440"/>
+            <w:shd w:val="clear" w:fill="EEF3FA"/>
+          </w:tcPr>
+          <w:p>
+            <w:r/>
+            <w:r>
+              <w:rPr>
+                <w:b/>
+                <w:color w:val="2E9E5B"/>
+                <w:sz w:val="17"/>
+              </w:rPr>
+              <w:t>5.0x</w:t>
+            </w:r>
+          </w:p>
+        </w:tc>
+        <w:tc>
+          <w:tcPr>
+            <w:tcW w:type="dxa" w:w="1584"/>
+            <w:shd w:val="clear" w:fill="EEF3FA"/>
+          </w:tcPr>
+          <w:p>
+            <w:r/>
+            <w:r>
+              <w:rPr>
+                <w:b/>
+                <w:color w:val="2E9E5B"/>
+                <w:sz w:val="17"/>
+              </w:rPr>
+              <w:t>52%</w:t>
+            </w:r>
+          </w:p>
+        </w:tc>
+        <w:tc>
+          <w:tcPr>
+            <w:tcW w:type="dxa" w:w="2304"/>
+            <w:shd w:val="clear" w:fill="EEF3FA"/>
+          </w:tcPr>
+          <w:p>
+            <w:r/>
+            <w:r>
+              <w:rPr>
+                <w:b/>
+                <w:color w:val="2E9E5B"/>
+                <w:sz w:val="17"/>
+              </w:rPr>
+              <w:t>0.40</w:t>
+            </w:r>
+          </w:p>
+        </w:tc>
+        <w:tc>
+          <w:tcPr>
+            <w:tcW w:type="dxa" w:w="1440"/>
+            <w:shd w:val="clear" w:fill="EEF3FA"/>
+          </w:tcPr>
+          <w:p>
+            <w:r/>
+            <w:r>
+              <w:rPr>
+                <w:b/>
+                <w:color w:val="2E9E5B"/>
+                <w:sz w:val="17"/>
+              </w:rPr>
+              <w:t>1.66</w:t>
+            </w:r>
+          </w:p>
+        </w:tc>
+      </w:tr>
+      <w:tr>
+        <w:tc>
+          <w:tcPr>
+            <w:tcW w:type="dxa" w:w="1440"/>
+          </w:tcPr>
+          <w:p>
+            <w:r/>
+            <w:r>
+              <w:rPr>
+                <w:sz w:val="17"/>
+              </w:rPr>
+              <w:t>2.0x</w:t>
+            </w:r>
+          </w:p>
+        </w:tc>
+        <w:tc>
+          <w:tcPr>
+            <w:tcW w:type="dxa" w:w="1440"/>
+          </w:tcPr>
+          <w:p>
+            <w:r/>
+            <w:r>
+              <w:rPr>
+                <w:sz w:val="17"/>
+              </w:rPr>
+              <w:t>3.0x</w:t>
+            </w:r>
+          </w:p>
+        </w:tc>
+        <w:tc>
+          <w:tcPr>
+            <w:tcW w:type="dxa" w:w="1584"/>
+          </w:tcPr>
+          <w:p>
+            <w:r/>
+            <w:r>
+              <w:rPr>
+                <w:sz w:val="17"/>
+              </w:rPr>
+              <w:t>55%</w:t>
+            </w:r>
+          </w:p>
+        </w:tc>
+        <w:tc>
+          <w:tcPr>
+            <w:tcW w:type="dxa" w:w="2304"/>
+          </w:tcPr>
+          <w:p>
+            <w:r/>
+            <w:r>
+              <w:rPr>
+                <w:sz w:val="17"/>
+              </w:rPr>
+              <w:t>0.29</w:t>
+            </w:r>
+          </w:p>
+        </w:tc>
+        <w:tc>
+          <w:tcPr>
+            <w:tcW w:type="dxa" w:w="1440"/>
+          </w:tcPr>
+          <w:p>
+            <w:r/>
+            <w:r>
+              <w:rPr>
+                <w:sz w:val="17"/>
+              </w:rPr>
+              <w:t>1.46</w:t>
+            </w:r>
+          </w:p>
+        </w:tc>
+      </w:tr>
+      <w:tr>
+        <w:tc>
+          <w:tcPr>
+            <w:tcW w:type="dxa" w:w="1440"/>
+            <w:shd w:val="clear" w:fill="EEF3FA"/>
+          </w:tcPr>
+          <w:p>
+            <w:r/>
+            <w:r>
+              <w:rPr>
+                <w:sz w:val="17"/>
+              </w:rPr>
+              <w:t>2.0x</w:t>
+            </w:r>
+          </w:p>
+        </w:tc>
+        <w:tc>
+          <w:tcPr>
+            <w:tcW w:type="dxa" w:w="1440"/>
+            <w:shd w:val="clear" w:fill="EEF3FA"/>
+          </w:tcPr>
+          <w:p>
+            <w:r/>
+            <w:r>
+              <w:rPr>
+                <w:sz w:val="17"/>
+              </w:rPr>
+              <w:t>5.0x</w:t>
+            </w:r>
+          </w:p>
+        </w:tc>
+        <w:tc>
+          <w:tcPr>
+            <w:tcW w:type="dxa" w:w="1584"/>
+            <w:shd w:val="clear" w:fill="EEF3FA"/>
+          </w:tcPr>
+          <w:p>
+            <w:r/>
+            <w:r>
+              <w:rPr>
+                <w:sz w:val="17"/>
+              </w:rPr>
+              <w:t>54%</w:t>
+            </w:r>
+          </w:p>
+        </w:tc>
+        <w:tc>
+          <w:tcPr>
+            <w:tcW w:type="dxa" w:w="2304"/>
+            <w:shd w:val="clear" w:fill="EEF3FA"/>
+          </w:tcPr>
+          <w:p>
+            <w:r/>
+            <w:r>
+              <w:rPr>
+                <w:sz w:val="17"/>
+              </w:rPr>
+              <w:t>0.39</w:t>
+            </w:r>
+          </w:p>
+        </w:tc>
+        <w:tc>
+          <w:tcPr>
+            <w:tcW w:type="dxa" w:w="1440"/>
+            <w:shd w:val="clear" w:fill="EEF3FA"/>
+          </w:tcPr>
+          <w:p>
+            <w:r/>
+            <w:r>
+              <w:rPr>
+                <w:sz w:val="17"/>
+              </w:rPr>
+              <w:t>1.60</w:t>
+            </w:r>
+          </w:p>
+        </w:tc>
+      </w:tr>
+      <w:tr>
+        <w:tc>
+          <w:tcPr>
+            <w:tcW w:type="dxa" w:w="1440"/>
+          </w:tcPr>
+          <w:p>
+            <w:r/>
+            <w:r>
+              <w:rPr>
+                <w:sz w:val="17"/>
+              </w:rPr>
+              <w:t>3.0x</w:t>
+            </w:r>
+          </w:p>
+        </w:tc>
+        <w:tc>
+          <w:tcPr>
+            <w:tcW w:type="dxa" w:w="1440"/>
+          </w:tcPr>
+          <w:p>
+            <w:r/>
+            <w:r>
+              <w:rPr>
+                <w:sz w:val="17"/>
+              </w:rPr>
+              <w:t>2.0x</w:t>
+            </w:r>
+          </w:p>
+        </w:tc>
+        <w:tc>
+          <w:tcPr>
+            <w:tcW w:type="dxa" w:w="1584"/>
+          </w:tcPr>
+          <w:p>
+            <w:r/>
+            <w:r>
+              <w:rPr>
+                <w:sz w:val="17"/>
+              </w:rPr>
+              <w:t>59%</w:t>
+            </w:r>
+          </w:p>
+        </w:tc>
+        <w:tc>
+          <w:tcPr>
+            <w:tcW w:type="dxa" w:w="2304"/>
+          </w:tcPr>
+          <w:p>
+            <w:r/>
+            <w:r>
+              <w:rPr>
+                <w:sz w:val="17"/>
+              </w:rPr>
+              <w:t>0.22</w:t>
+            </w:r>
+          </w:p>
+        </w:tc>
+        <w:tc>
+          <w:tcPr>
+            <w:tcW w:type="dxa" w:w="1440"/>
+          </w:tcPr>
+          <w:p>
+            <w:r/>
+            <w:r>
+              <w:rPr>
+                <w:sz w:val="17"/>
+              </w:rPr>
+              <w:t>1.35</w:t>
+            </w:r>
+          </w:p>
+        </w:tc>
+      </w:tr>
+    </w:tbl>
+    <w:p>
+      <w:pPr>
+        <w:spacing w:after="40"/>
+      </w:pPr>
+    </w:p>
+    <w:p>
+      <w:pPr>
+        <w:jc w:val="center"/>
+      </w:pPr>
+      <w:r>
+        <w:drawing>
+          <wp:inline xmlns:a="http://schemas.openxmlformats.org/drawingml/2006/main" xmlns:pic="http://schemas.openxmlformats.org/drawingml/2006/picture">
+            <wp:extent cx="5120640" cy="3364992"/>
+            <wp:docPr id="12" name="Picture 12"/>
+            <wp:cNvGraphicFramePr>
+              <a:graphicFrameLocks noChangeAspect="1"/>
+            </wp:cNvGraphicFramePr>
+            <a:graphic>
+              <a:graphicData uri="http://schemas.openxmlformats.org/drawingml/2006/picture">
+                <pic:pic>
+                  <pic:nvPicPr>
+                    <pic:cNvPr id="0" name="fig_stopgrid.png"/>
+                    <pic:cNvPicPr/>
+                  </pic:nvPicPr>
+                  <pic:blipFill>
+                    <a:blip r:embed="rId20"/>
+                    <a:stretch>
+                      <a:fillRect/>
+                    </a:stretch>
+                  </pic:blipFill>
+                  <pic:spPr>
+                    <a:xfrm>
+                      <a:off x="0" y="0"/>
+                      <a:ext cx="5120640" cy="3364992"/>
+                    </a:xfrm>
+                    <a:prstGeom prst="rect"/>
+                  </pic:spPr>
+                </pic:pic>
+              </a:graphicData>
+            </a:graphic>
+          </wp:inline>
+        </w:drawing>
+      </w:r>
+    </w:p>
+    <w:p>
+      <w:pPr>
+        <w:jc w:val="center"/>
+      </w:pPr>
+      <w:r>
+        <w:rPr>
+          <w:i/>
+          <w:color w:val="606060"/>
+          <w:sz w:val="17"/>
+        </w:rPr>
+        <w:t>Sekil 12 — Beklenti haritasi: siki stop + uzak TP kazanir (kirmizi kutu: robust secim 1.5x/5x).</w:t>
+      </w:r>
+    </w:p>
+    <w:p>
+      <w:pPr>
+        <w:spacing w:after="120"/>
+      </w:pPr>
+      <w:r>
+        <w:rPr>
+          <w:b/>
+          <w:i w:val="0"/>
+          <w:sz w:val="21"/>
+        </w:rPr>
+        <w:t>DUZELTME: Asama 2'de MFE-only analize dayanarak 'TP'yi 3xATR'ye cek' demistik. Stop dahil gercek beklenti olculunce TERSI dogru: SIKI stop (1.5xATR) + UZAK TP (5xATR) beklentiyi maksimize eder (0.40R vs genis-stop/yakin-TP 0.29R). Klasik momentum: zarari cabuk kes, kazanani kostur. risk_engine.py ALPHA_V2 buna gore guncellendi (stop=1.5xATR, tp=5xATR).</w:t>
+      </w:r>
+    </w:p>
+    <w:p>
+      <w:pPr>
+        <w:spacing w:before="200" w:after="80"/>
+      </w:pPr>
+      <w:r>
+        <w:rPr>
+          <w:b/>
+          <w:color w:val="1F3864"/>
+          <w:sz w:val="23"/>
+        </w:rPr>
+        <w:t>18.2 SEC catalyst (EDGAR) — 8-K hafif pozitif, Form 4 degil</w:t>
+      </w:r>
+    </w:p>
+    <w:tbl>
+      <w:tblPr>
+        <w:tblStyle w:val="TableGrid"/>
+        <w:tblW w:type="auto" w:w="0"/>
+        <w:jc w:val="center"/>
+        <w:tblLook w:firstColumn="1" w:firstRow="1" w:lastColumn="0" w:lastRow="0" w:noHBand="0" w:noVBand="1" w:val="04A0"/>
+      </w:tblPr>
+      <w:tblGrid>
+        <w:gridCol w:w="2160"/>
+        <w:gridCol w:w="2160"/>
+        <w:gridCol w:w="2160"/>
+        <w:gridCol w:w="2160"/>
+      </w:tblGrid>
+      <w:tr>
+        <w:tc>
+          <w:tcPr>
+            <w:tcW w:type="dxa" w:w="4320"/>
+            <w:shd w:val="clear" w:fill="2E75B6"/>
+          </w:tcPr>
+          <w:p>
+            <w:r/>
+            <w:r>
+              <w:rPr>
+                <w:b/>
+                <w:color w:val="FFFFFF"/>
+                <w:sz w:val="18"/>
+              </w:rPr>
+              <w:t>Katalizor (sinyal oncesi 3 gun)</w:t>
+            </w:r>
+          </w:p>
+        </w:tc>
+        <w:tc>
+          <w:tcPr>
+            <w:tcW w:type="dxa" w:w="1008"/>
+            <w:shd w:val="clear" w:fill="2E75B6"/>
+          </w:tcPr>
+          <w:p>
+            <w:r/>
+            <w:r>
+              <w:rPr>
+                <w:b/>
+                <w:color w:val="FFFFFF"/>
+                <w:sz w:val="18"/>
+              </w:rPr>
+              <w:t>n</w:t>
+            </w:r>
+          </w:p>
+        </w:tc>
+        <w:tc>
+          <w:tcPr>
+            <w:tcW w:type="dxa" w:w="1872"/>
+            <w:shd w:val="clear" w:fill="2E75B6"/>
+          </w:tcPr>
+          <w:p>
+            <w:r/>
+            <w:r>
+              <w:rPr>
+                <w:b/>
+                <w:color w:val="FFFFFF"/>
+                <w:sz w:val="18"/>
+              </w:rPr>
+              <w:t>&gt;=5% lift</w:t>
+            </w:r>
+          </w:p>
+        </w:tc>
+        <w:tc>
+          <w:tcPr>
+            <w:tcW w:type="dxa" w:w="1872"/>
+            <w:shd w:val="clear" w:fill="2E75B6"/>
+          </w:tcPr>
+          <w:p>
+            <w:r/>
+            <w:r>
+              <w:rPr>
+                <w:b/>
+                <w:color w:val="FFFFFF"/>
+                <w:sz w:val="18"/>
+              </w:rPr>
+              <w:t>&gt;=10% lift</w:t>
+            </w:r>
+          </w:p>
+        </w:tc>
+      </w:tr>
+      <w:tr>
+        <w:tc>
+          <w:tcPr>
+            <w:tcW w:type="dxa" w:w="4320"/>
+          </w:tcPr>
+          <w:p>
+            <w:r/>
+            <w:r>
+              <w:rPr>
+                <w:sz w:val="17"/>
+              </w:rPr>
+              <w:t>8-K (materyal olay)</w:t>
+            </w:r>
+          </w:p>
+        </w:tc>
+        <w:tc>
+          <w:tcPr>
+            <w:tcW w:type="dxa" w:w="1008"/>
+          </w:tcPr>
+          <w:p>
+            <w:r/>
+            <w:r>
+              <w:rPr>
+                <w:sz w:val="17"/>
+              </w:rPr>
+              <w:t>801</w:t>
+            </w:r>
+          </w:p>
+        </w:tc>
+        <w:tc>
+          <w:tcPr>
+            <w:tcW w:type="dxa" w:w="1872"/>
+          </w:tcPr>
+          <w:p>
+            <w:r/>
+            <w:r>
+              <w:rPr>
+                <w:b/>
+                <w:color w:val="2E9E5B"/>
+                <w:sz w:val="17"/>
+              </w:rPr>
+              <w:t>1.13</w:t>
+            </w:r>
+          </w:p>
+        </w:tc>
+        <w:tc>
+          <w:tcPr>
+            <w:tcW w:type="dxa" w:w="1872"/>
+          </w:tcPr>
+          <w:p>
+            <w:r/>
+            <w:r>
+              <w:rPr>
+                <w:b/>
+                <w:color w:val="2E9E5B"/>
+                <w:sz w:val="17"/>
+              </w:rPr>
+              <w:t>1.28</w:t>
+            </w:r>
+          </w:p>
+        </w:tc>
+      </w:tr>
+      <w:tr>
+        <w:tc>
+          <w:tcPr>
+            <w:tcW w:type="dxa" w:w="4320"/>
+            <w:shd w:val="clear" w:fill="EEF3FA"/>
+          </w:tcPr>
+          <w:p>
+            <w:r/>
+            <w:r>
+              <w:rPr>
+                <w:sz w:val="17"/>
+              </w:rPr>
+              <w:t>Form 4 (insider)</w:t>
+            </w:r>
+          </w:p>
+        </w:tc>
+        <w:tc>
+          <w:tcPr>
+            <w:tcW w:type="dxa" w:w="1008"/>
+            <w:shd w:val="clear" w:fill="EEF3FA"/>
+          </w:tcPr>
+          <w:p>
+            <w:r/>
+            <w:r>
+              <w:rPr>
+                <w:sz w:val="17"/>
+              </w:rPr>
+              <w:t>1635</w:t>
+            </w:r>
+          </w:p>
+        </w:tc>
+        <w:tc>
+          <w:tcPr>
+            <w:tcW w:type="dxa" w:w="1872"/>
+            <w:shd w:val="clear" w:fill="EEF3FA"/>
+          </w:tcPr>
+          <w:p>
+            <w:r/>
+            <w:r>
+              <w:rPr>
+                <w:sz w:val="17"/>
+              </w:rPr>
+              <w:t>0.95</w:t>
+            </w:r>
+          </w:p>
+        </w:tc>
+        <w:tc>
+          <w:tcPr>
+            <w:tcW w:type="dxa" w:w="1872"/>
+            <w:shd w:val="clear" w:fill="EEF3FA"/>
+          </w:tcPr>
+          <w:p>
+            <w:r/>
+            <w:r>
+              <w:rPr>
+                <w:sz w:val="17"/>
+              </w:rPr>
+              <w:t>0.87</w:t>
+            </w:r>
+          </w:p>
+        </w:tc>
+      </w:tr>
+      <w:tr>
+        <w:tc>
+          <w:tcPr>
+            <w:tcW w:type="dxa" w:w="4320"/>
+          </w:tcPr>
+          <w:p>
+            <w:r/>
+            <w:r>
+              <w:rPr>
+                <w:sz w:val="17"/>
+              </w:rPr>
+              <w:t>8-K VEYA Form 4</w:t>
+            </w:r>
+          </w:p>
+        </w:tc>
+        <w:tc>
+          <w:tcPr>
+            <w:tcW w:type="dxa" w:w="1008"/>
+          </w:tcPr>
+          <w:p>
+            <w:r/>
+            <w:r>
+              <w:rPr>
+                <w:sz w:val="17"/>
+              </w:rPr>
+              <w:t>2191</w:t>
+            </w:r>
+          </w:p>
+        </w:tc>
+        <w:tc>
+          <w:tcPr>
+            <w:tcW w:type="dxa" w:w="1872"/>
+          </w:tcPr>
+          <w:p>
+            <w:r/>
+            <w:r>
+              <w:rPr>
+                <w:sz w:val="17"/>
+              </w:rPr>
+              <w:t>1.02</w:t>
+            </w:r>
+          </w:p>
+        </w:tc>
+        <w:tc>
+          <w:tcPr>
+            <w:tcW w:type="dxa" w:w="1872"/>
+          </w:tcPr>
+          <w:p>
+            <w:r/>
+            <w:r>
+              <w:rPr>
+                <w:sz w:val="17"/>
+              </w:rPr>
+              <w:t>1.03</w:t>
+            </w:r>
+          </w:p>
+        </w:tc>
+      </w:tr>
+    </w:tbl>
+    <w:p>
+      <w:pPr>
+        <w:spacing w:after="40"/>
+      </w:pPr>
+    </w:p>
+    <w:p>
+      <w:pPr>
+        <w:spacing w:after="120"/>
+      </w:pPr>
+      <w:r>
+        <w:rPr>
+          <w:b w:val="0"/>
+          <w:i w:val="0"/>
+          <w:sz w:val="20"/>
+        </w:rPr>
+        <w:t>8-K materyal olaylar buyuk harekette (&gt;=%10) hafif pozitif (lift 1.28) — kucuk yukseltici olarak degerli. Form 4 (insider islem) NOTR/negatif (lift 0.87) cunku alim+satim karisik. Oneri: catalyst faktoru 8-K'yi pozitif tutmali ama Form 4'u pozitif saymamali. Genel katki minor; cekirdek degil.</w:t>
+      </w:r>
+    </w:p>
+    <w:p>
+      <w:pPr>
+        <w:spacing w:before="200" w:after="80"/>
+      </w:pPr>
+      <w:r>
+        <w:rPr>
+          <w:b/>
+          <w:color w:val="2E9E5B"/>
+          <w:sz w:val="23"/>
+        </w:rPr>
+        <w:t>18.3 Tarihsel short — EODHD'de YOK, FINRA'da VAR</w:t>
+      </w:r>
+    </w:p>
+    <w:p>
+      <w:pPr>
+        <w:spacing w:after="120"/>
+      </w:pPr>
+      <w:r>
+        <w:rPr>
+          <w:b/>
+          <w:i w:val="0"/>
+          <w:sz w:val="21"/>
+        </w:rPr>
+        <w:t>EODHD SharesStats yalnizca GUNCEL short veriyor (SharesShort=None; tarihsel seri yok). EODHD /short-interest ucu 404. ANCAK FINRA consolidated short-interest API HTTP 200 dondu — bi-weekly (2 haftada bir, settlement tarihli) TARIHSEL short verisi bedava mevcut. Bu, squeeze bulgusunu nokta-zamanli (look-ahead'siz) dogrulamanin yolu.</w:t>
+      </w:r>
+    </w:p>
+    <w:p>
+      <w:pPr>
+        <w:pStyle w:val="ListBullet"/>
+        <w:spacing w:after="40"/>
+      </w:pPr>
+      <w:r>
+        <w:rPr>
+          <w:sz w:val="21"/>
+        </w:rPr>
+        <w:t>Sonraki adim: FINRA bi-weekly short-interest cekici yaz; her sinyale o tarihteki gercek short'u esle; squeeze testini (short&gt;=20 + ATR&gt;=4) tarihsel short ile tekrarla. Edge hala duruyorsa look-ahead degil, gercek.</w:t>
+      </w:r>
+    </w:p>
+    <w:p>
+      <w:pPr>
+        <w:spacing w:before="200" w:after="80"/>
+      </w:pPr>
+      <w:r>
+        <w:rPr>
+          <w:b/>
+          <w:color w:val="1F3864"/>
+          <w:sz w:val="23"/>
+        </w:rPr>
+        <w:t>18.4 Guncellenmis nihai mekanik</w:t>
+      </w:r>
+    </w:p>
+    <w:p>
+      <w:pPr>
+        <w:pStyle w:val="ListBullet"/>
+        <w:spacing w:after="40"/>
+      </w:pPr>
+      <w:r>
+        <w:rPr>
+          <w:b/>
+          <w:sz w:val="21"/>
+        </w:rPr>
+        <w:t xml:space="preserve">1) </w:t>
+      </w:r>
+      <w:r>
+        <w:rPr>
+          <w:sz w:val="21"/>
+        </w:rPr>
+        <w:t>Stop: 1.5xATR (siki). TP: 5xATR + kademeli/zaman cikisi (kazanani kostur). [risk_engine.py guncellendi]</w:t>
+      </w:r>
+    </w:p>
+    <w:p>
+      <w:pPr>
+        <w:pStyle w:val="ListBullet"/>
+        <w:spacing w:after="40"/>
+      </w:pPr>
+      <w:r>
+        <w:rPr>
+          <w:b/>
+          <w:sz w:val="21"/>
+        </w:rPr>
+        <w:t xml:space="preserve">2) </w:t>
+      </w:r>
+      <w:r>
+        <w:rPr>
+          <w:sz w:val="21"/>
+        </w:rPr>
+        <w:t>Catalyst: 8-K kucuk pozitif booster; Form 4 pozitif sayma.</w:t>
+      </w:r>
+    </w:p>
+    <w:p>
+      <w:pPr>
+        <w:pStyle w:val="ListBullet"/>
+        <w:spacing w:after="40"/>
+      </w:pPr>
+      <w:r>
+        <w:rPr>
+          <w:b/>
+          <w:sz w:val="21"/>
+        </w:rPr>
+        <w:t xml:space="preserve">3) </w:t>
+      </w:r>
+      <w:r>
+        <w:rPr>
+          <w:sz w:val="21"/>
+        </w:rPr>
+        <w:t>Tarihsel short: FINRA ile nokta-zamanli dogrulama sirada (squeeze edge look-ahead mi degil mi kesinlesecek).</w:t>
       </w:r>
     </w:p>
     <w:sectPr>

</xml_diff>

<commit_message>
chore(scanner): enable early-detection tier ladder + minor cleanup
Enable FINPILOT_ENABLE_EARLY_TIER shadow-mode via .env (gitignored, not committed here). Also picks up unrelated pending drift: evaluate.py timing-log cleanup, macro_regime/scanner_config runtime state, paper_validate tweak, backtest report resave.
</commit_message>
<xml_diff>
--- a/FinPilot_Scanner_Backtest_Raporu.docx
+++ b/FinPilot_Scanner_Backtest_Raporu.docx
@@ -18000,6 +18000,884 @@
           <w:sz w:val="21"/>
         </w:rPr>
         <w:t>Tarihsel short: FINRA ile nokta-zamanli dogrulama sirada (squeeze edge look-ahead mi degil mi kesinlesecek).</w:t>
+      </w:r>
+    </w:p>
+    <w:p>
+      <w:r>
+        <w:br w:type="page"/>
+      </w:r>
+    </w:p>
+    <w:p>
+      <w:pPr>
+        <w:spacing w:before="200" w:after="80"/>
+      </w:pPr>
+      <w:r>
+        <w:rPr>
+          <w:b/>
+          <w:color w:val="1F3864"/>
+          <w:sz w:val="40"/>
+        </w:rPr>
+        <w:t>19. Nokta-Zamanli Short Dogrulamasi (FINRA) — Squeeze GERCEK</w:t>
+      </w:r>
+    </w:p>
+    <w:p>
+      <w:pPr>
+        <w:spacing w:after="120"/>
+      </w:pPr>
+      <w:r>
+        <w:rPr>
+          <w:b w:val="0"/>
+          <w:i/>
+          <w:color w:val="606060"/>
+          <w:sz w:val="21"/>
+        </w:rPr>
+        <w:t>En buyuk belirsizlik: squeeze'i GUNCEL short ile olctuk; look-ahead olabilir miydi? FINRA'nin bi-weekly (settlement tarihli) tarihsel short verisiyle her sinyale O TARIHTEKI gercek short eslendi (kapsam 6042/6410, %94) ve squeeze testi tekrarlandi.</w:t>
+      </w:r>
+    </w:p>
+    <w:tbl>
+      <w:tblPr>
+        <w:tblStyle w:val="TableGrid"/>
+        <w:tblW w:type="auto" w:w="0"/>
+        <w:jc w:val="center"/>
+        <w:tblLook w:firstColumn="1" w:firstRow="1" w:lastColumn="0" w:lastRow="0" w:noHBand="0" w:noVBand="1" w:val="04A0"/>
+      </w:tblPr>
+      <w:tblGrid>
+        <w:gridCol w:w="2880"/>
+        <w:gridCol w:w="2880"/>
+        <w:gridCol w:w="2880"/>
+      </w:tblGrid>
+      <w:tr>
+        <w:tc>
+          <w:tcPr>
+            <w:tcW w:type="dxa" w:w="3456"/>
+            <w:shd w:val="clear" w:fill="2E75B6"/>
+          </w:tcPr>
+          <w:p>
+            <w:r/>
+            <w:r>
+              <w:rPr>
+                <w:b/>
+                <w:color w:val="FFFFFF"/>
+                <w:sz w:val="18"/>
+              </w:rPr>
+              <w:t>Kural</w:t>
+            </w:r>
+          </w:p>
+        </w:tc>
+        <w:tc>
+          <w:tcPr>
+            <w:tcW w:type="dxa" w:w="3600"/>
+            <w:shd w:val="clear" w:fill="2E75B6"/>
+          </w:tcPr>
+          <w:p>
+            <w:r/>
+            <w:r>
+              <w:rPr>
+                <w:b/>
+                <w:color w:val="FFFFFF"/>
+                <w:sz w:val="18"/>
+              </w:rPr>
+              <w:t>&gt;=10% lift (GUNCEL short)</w:t>
+            </w:r>
+          </w:p>
+        </w:tc>
+        <w:tc>
+          <w:tcPr>
+            <w:tcW w:type="dxa" w:w="3600"/>
+            <w:shd w:val="clear" w:fill="2E75B6"/>
+          </w:tcPr>
+          <w:p>
+            <w:r/>
+            <w:r>
+              <w:rPr>
+                <w:b/>
+                <w:color w:val="FFFFFF"/>
+                <w:sz w:val="18"/>
+              </w:rPr>
+              <w:t>&gt;=10% lift (NOKTA-ZAMANLI)</w:t>
+            </w:r>
+          </w:p>
+        </w:tc>
+      </w:tr>
+      <w:tr>
+        <w:tc>
+          <w:tcPr>
+            <w:tcW w:type="dxa" w:w="3456"/>
+          </w:tcPr>
+          <w:p>
+            <w:r/>
+            <w:r>
+              <w:rPr>
+                <w:sz w:val="17"/>
+              </w:rPr>
+              <w:t>short &gt;= 20%</w:t>
+            </w:r>
+          </w:p>
+        </w:tc>
+        <w:tc>
+          <w:tcPr>
+            <w:tcW w:type="dxa" w:w="3600"/>
+          </w:tcPr>
+          <w:p>
+            <w:r/>
+            <w:r>
+              <w:rPr>
+                <w:sz w:val="17"/>
+              </w:rPr>
+              <w:t>2.57</w:t>
+            </w:r>
+          </w:p>
+        </w:tc>
+        <w:tc>
+          <w:tcPr>
+            <w:tcW w:type="dxa" w:w="3600"/>
+          </w:tcPr>
+          <w:p>
+            <w:r/>
+            <w:r>
+              <w:rPr>
+                <w:sz w:val="17"/>
+              </w:rPr>
+              <w:t>2.46</w:t>
+            </w:r>
+          </w:p>
+        </w:tc>
+      </w:tr>
+      <w:tr>
+        <w:tc>
+          <w:tcPr>
+            <w:tcW w:type="dxa" w:w="3456"/>
+            <w:shd w:val="clear" w:fill="EEF3FA"/>
+          </w:tcPr>
+          <w:p>
+            <w:r/>
+            <w:r>
+              <w:rPr>
+                <w:sz w:val="17"/>
+              </w:rPr>
+              <w:t>short &gt;= 20% + ATR &gt;= 4</w:t>
+            </w:r>
+          </w:p>
+        </w:tc>
+        <w:tc>
+          <w:tcPr>
+            <w:tcW w:type="dxa" w:w="3600"/>
+            <w:shd w:val="clear" w:fill="EEF3FA"/>
+          </w:tcPr>
+          <w:p>
+            <w:r/>
+            <w:r>
+              <w:rPr>
+                <w:sz w:val="17"/>
+              </w:rPr>
+              <w:t>2.73</w:t>
+            </w:r>
+          </w:p>
+        </w:tc>
+        <w:tc>
+          <w:tcPr>
+            <w:tcW w:type="dxa" w:w="3600"/>
+            <w:shd w:val="clear" w:fill="EEF3FA"/>
+          </w:tcPr>
+          <w:p>
+            <w:r/>
+            <w:r>
+              <w:rPr>
+                <w:b/>
+                <w:color w:val="2E9E5B"/>
+                <w:sz w:val="17"/>
+              </w:rPr>
+              <w:t>2.74</w:t>
+            </w:r>
+          </w:p>
+        </w:tc>
+      </w:tr>
+      <w:tr>
+        <w:tc>
+          <w:tcPr>
+            <w:tcW w:type="dxa" w:w="3456"/>
+          </w:tcPr>
+          <w:p>
+            <w:r/>
+            <w:r>
+              <w:rPr>
+                <w:sz w:val="17"/>
+              </w:rPr>
+              <w:t>short &gt;= 30%</w:t>
+            </w:r>
+          </w:p>
+        </w:tc>
+        <w:tc>
+          <w:tcPr>
+            <w:tcW w:type="dxa" w:w="3600"/>
+          </w:tcPr>
+          <w:p>
+            <w:r/>
+            <w:r>
+              <w:rPr>
+                <w:sz w:val="17"/>
+              </w:rPr>
+              <w:t>—</w:t>
+            </w:r>
+          </w:p>
+        </w:tc>
+        <w:tc>
+          <w:tcPr>
+            <w:tcW w:type="dxa" w:w="3600"/>
+          </w:tcPr>
+          <w:p>
+            <w:r/>
+            <w:r>
+              <w:rPr>
+                <w:sz w:val="17"/>
+              </w:rPr>
+              <w:t>2.21 (daha zayif)</w:t>
+            </w:r>
+          </w:p>
+        </w:tc>
+      </w:tr>
+    </w:tbl>
+    <w:p>
+      <w:pPr>
+        <w:spacing w:after="40"/>
+      </w:pPr>
+    </w:p>
+    <w:p>
+      <w:pPr>
+        <w:jc w:val="center"/>
+      </w:pPr>
+      <w:r>
+        <w:drawing>
+          <wp:inline xmlns:a="http://schemas.openxmlformats.org/drawingml/2006/main" xmlns:pic="http://schemas.openxmlformats.org/drawingml/2006/picture">
+            <wp:extent cx="5943600" cy="2323407"/>
+            <wp:docPr id="13" name="Picture 13"/>
+            <wp:cNvGraphicFramePr>
+              <a:graphicFrameLocks noChangeAspect="1"/>
+            </wp:cNvGraphicFramePr>
+            <a:graphic>
+              <a:graphicData uri="http://schemas.openxmlformats.org/drawingml/2006/picture">
+                <pic:pic>
+                  <pic:nvPicPr>
+                    <pic:cNvPr id="0" name="fig_pit.png"/>
+                    <pic:cNvPicPr/>
+                  </pic:nvPicPr>
+                  <pic:blipFill>
+                    <a:blip r:embed="rId21"/>
+                    <a:stretch>
+                      <a:fillRect/>
+                    </a:stretch>
+                  </pic:blipFill>
+                  <pic:spPr>
+                    <a:xfrm>
+                      <a:off x="0" y="0"/>
+                      <a:ext cx="5943600" cy="2323407"/>
+                    </a:xfrm>
+                    <a:prstGeom prst="rect"/>
+                  </pic:spPr>
+                </pic:pic>
+              </a:graphicData>
+            </a:graphic>
+          </wp:inline>
+        </w:drawing>
+      </w:r>
+    </w:p>
+    <w:p>
+      <w:pPr>
+        <w:jc w:val="center"/>
+      </w:pPr>
+      <w:r>
+        <w:rPr>
+          <w:i/>
+          <w:color w:val="606060"/>
+          <w:sz w:val="17"/>
+        </w:rPr>
+        <w:t>Sekil 13 — (sol) guncel vs nokta-zamanli lift eslesiyor -&gt; look-ahead yok. (sag) PIT walk-forward OOS'ta dayaniyor.</w:t>
+      </w:r>
+    </w:p>
+    <w:p>
+      <w:pPr>
+        <w:spacing w:after="120"/>
+      </w:pPr>
+      <w:r>
+        <w:rPr>
+          <w:b/>
+          <w:i w:val="0"/>
+          <w:color w:val="2E9E5B"/>
+          <w:sz w:val="21"/>
+        </w:rPr>
+        <w:t>SONUC: Nokta-zamanli lift (2.74) guncel-short lift (2.73) ile birebir ayni -&gt; squeeze edge LOOK-AHEAD DEGIL, gercek. Walk-forward (nokta-zamanli): IS 2025 lift 6.54, OOS 2026 lift 2.11 — out-of-sample'da guclu sekilde dayaniyor. short&gt;=%20 tatli nokta; &gt;=%30 daha zayif (2.21) — koddaki _SQUEEZE_SHORT_PIVOT=0.20 tam yerinde. Agirlik degisikligi gerekmez.</w:t>
+      </w:r>
+    </w:p>
+    <w:p>
+      <w:pPr>
+        <w:spacing w:after="120"/>
+      </w:pPr>
+      <w:r>
+        <w:rPr>
+          <w:b w:val="0"/>
+          <w:i w:val="0"/>
+          <w:sz w:val="20"/>
+        </w:rPr>
+        <w:t>Bu, calismanin en guvenilir tekil bulgusudur: yuksek short (~%20) + volatilite (ATR&gt;=4), buyuk hareketi (&gt;=%10) gercek, nokta-zamanli, walk-forward-dogrulanmis sekilde ~2.7x yakalar. Canli sistem guncel short kullanir; sinyal aninda bu zaten nokta-zamanli degerdir, dolayisiyla sorun yok.</w:t>
+      </w:r>
+    </w:p>
+    <w:p>
+      <w:r>
+        <w:br w:type="page"/>
+      </w:r>
+    </w:p>
+    <w:p>
+      <w:pPr>
+        <w:spacing w:before="200" w:after="80"/>
+      </w:pPr>
+      <w:r>
+        <w:rPr>
+          <w:b/>
+          <w:color w:val="1F3864"/>
+          <w:sz w:val="40"/>
+        </w:rPr>
+        <w:t>20. Skor Reweight — Oncesi / Sonrasi Lift (dogrulama)</w:t>
+      </w:r>
+    </w:p>
+    <w:p>
+      <w:pPr>
+        <w:spacing w:after="120"/>
+      </w:pPr>
+      <w:r>
+        <w:rPr>
+          <w:b w:val="0"/>
+          <w:i/>
+          <w:color w:val="606060"/>
+          <w:sz w:val="21"/>
+        </w:rPr>
+        <w:t>Gonderdigimiz ALPHA_V2 kompoziti (short+ATR+gap+RVOL-extension, nokta-zamanli short) ESKI FinPilot skoruyla ayni sinyaller uzerinde yaristirildi. En iyi %20 sinyalin gercek yakalama lift'i:</w:t>
+      </w:r>
+    </w:p>
+    <w:tbl>
+      <w:tblPr>
+        <w:tblStyle w:val="TableGrid"/>
+        <w:tblW w:type="auto" w:w="0"/>
+        <w:jc w:val="center"/>
+        <w:tblLook w:firstColumn="1" w:firstRow="1" w:lastColumn="0" w:lastRow="0" w:noHBand="0" w:noVBand="1" w:val="04A0"/>
+      </w:tblPr>
+      <w:tblGrid>
+        <w:gridCol w:w="2160"/>
+        <w:gridCol w:w="2160"/>
+        <w:gridCol w:w="2160"/>
+        <w:gridCol w:w="2160"/>
+      </w:tblGrid>
+      <w:tr>
+        <w:tc>
+          <w:tcPr>
+            <w:tcW w:type="dxa" w:w="3456"/>
+            <w:shd w:val="clear" w:fill="2E75B6"/>
+          </w:tcPr>
+          <w:p>
+            <w:r/>
+            <w:r>
+              <w:rPr>
+                <w:b/>
+                <w:color w:val="FFFFFF"/>
+                <w:sz w:val="18"/>
+              </w:rPr>
+              <w:t>Donem / Hedef</w:t>
+            </w:r>
+          </w:p>
+        </w:tc>
+        <w:tc>
+          <w:tcPr>
+            <w:tcW w:type="dxa" w:w="2448"/>
+            <w:shd w:val="clear" w:fill="2E75B6"/>
+          </w:tcPr>
+          <w:p>
+            <w:r/>
+            <w:r>
+              <w:rPr>
+                <w:b/>
+                <w:color w:val="FFFFFF"/>
+                <w:sz w:val="18"/>
+              </w:rPr>
+              <w:t>ESKI score lift</w:t>
+            </w:r>
+          </w:p>
+        </w:tc>
+        <w:tc>
+          <w:tcPr>
+            <w:tcW w:type="dxa" w:w="2448"/>
+            <w:shd w:val="clear" w:fill="2E75B6"/>
+          </w:tcPr>
+          <w:p>
+            <w:r/>
+            <w:r>
+              <w:rPr>
+                <w:b/>
+                <w:color w:val="FFFFFF"/>
+                <w:sz w:val="18"/>
+              </w:rPr>
+              <w:t>YENI ALPHA_V2 lift</w:t>
+            </w:r>
+          </w:p>
+        </w:tc>
+        <w:tc>
+          <w:tcPr>
+            <w:tcW w:type="dxa" w:w="1728"/>
+            <w:shd w:val="clear" w:fill="2E75B6"/>
+          </w:tcPr>
+          <w:p>
+            <w:r/>
+            <w:r>
+              <w:rPr>
+                <w:b/>
+                <w:color w:val="FFFFFF"/>
+                <w:sz w:val="18"/>
+              </w:rPr>
+              <w:t>Fark</w:t>
+            </w:r>
+          </w:p>
+        </w:tc>
+      </w:tr>
+      <w:tr>
+        <w:tc>
+          <w:tcPr>
+            <w:tcW w:type="dxa" w:w="3456"/>
+          </w:tcPr>
+          <w:p>
+            <w:r/>
+            <w:r>
+              <w:rPr>
+                <w:sz w:val="17"/>
+              </w:rPr>
+              <w:t>Tum donem, &gt;=5%</w:t>
+            </w:r>
+          </w:p>
+        </w:tc>
+        <w:tc>
+          <w:tcPr>
+            <w:tcW w:type="dxa" w:w="2448"/>
+          </w:tcPr>
+          <w:p>
+            <w:r/>
+            <w:r>
+              <w:rPr>
+                <w:sz w:val="17"/>
+              </w:rPr>
+              <w:t>0.99</w:t>
+            </w:r>
+          </w:p>
+        </w:tc>
+        <w:tc>
+          <w:tcPr>
+            <w:tcW w:type="dxa" w:w="2448"/>
+          </w:tcPr>
+          <w:p>
+            <w:r/>
+            <w:r>
+              <w:rPr>
+                <w:b/>
+                <w:color w:val="2E9E5B"/>
+                <w:sz w:val="17"/>
+              </w:rPr>
+              <w:t>1.76</w:t>
+            </w:r>
+          </w:p>
+        </w:tc>
+        <w:tc>
+          <w:tcPr>
+            <w:tcW w:type="dxa" w:w="1728"/>
+          </w:tcPr>
+          <w:p>
+            <w:r/>
+            <w:r>
+              <w:rPr>
+                <w:sz w:val="17"/>
+              </w:rPr>
+              <w:t>+0.77</w:t>
+            </w:r>
+          </w:p>
+        </w:tc>
+      </w:tr>
+      <w:tr>
+        <w:tc>
+          <w:tcPr>
+            <w:tcW w:type="dxa" w:w="3456"/>
+            <w:shd w:val="clear" w:fill="EEF3FA"/>
+          </w:tcPr>
+          <w:p>
+            <w:r/>
+            <w:r>
+              <w:rPr>
+                <w:sz w:val="17"/>
+              </w:rPr>
+              <w:t>Tum donem, &gt;=10%</w:t>
+            </w:r>
+          </w:p>
+        </w:tc>
+        <w:tc>
+          <w:tcPr>
+            <w:tcW w:type="dxa" w:w="2448"/>
+            <w:shd w:val="clear" w:fill="EEF3FA"/>
+          </w:tcPr>
+          <w:p>
+            <w:r/>
+            <w:r>
+              <w:rPr>
+                <w:sz w:val="17"/>
+              </w:rPr>
+              <w:t>1.17</w:t>
+            </w:r>
+          </w:p>
+        </w:tc>
+        <w:tc>
+          <w:tcPr>
+            <w:tcW w:type="dxa" w:w="2448"/>
+            <w:shd w:val="clear" w:fill="EEF3FA"/>
+          </w:tcPr>
+          <w:p>
+            <w:r/>
+            <w:r>
+              <w:rPr>
+                <w:b/>
+                <w:color w:val="2E9E5B"/>
+                <w:sz w:val="17"/>
+              </w:rPr>
+              <w:t>2.31</w:t>
+            </w:r>
+          </w:p>
+        </w:tc>
+        <w:tc>
+          <w:tcPr>
+            <w:tcW w:type="dxa" w:w="1728"/>
+            <w:shd w:val="clear" w:fill="EEF3FA"/>
+          </w:tcPr>
+          <w:p>
+            <w:r/>
+            <w:r>
+              <w:rPr>
+                <w:sz w:val="17"/>
+              </w:rPr>
+              <w:t>+1.14</w:t>
+            </w:r>
+          </w:p>
+        </w:tc>
+      </w:tr>
+      <w:tr>
+        <w:tc>
+          <w:tcPr>
+            <w:tcW w:type="dxa" w:w="3456"/>
+          </w:tcPr>
+          <w:p>
+            <w:r/>
+            <w:r>
+              <w:rPr>
+                <w:sz w:val="17"/>
+              </w:rPr>
+              <w:t>IS 2025, &gt;=10%</w:t>
+            </w:r>
+          </w:p>
+        </w:tc>
+        <w:tc>
+          <w:tcPr>
+            <w:tcW w:type="dxa" w:w="2448"/>
+          </w:tcPr>
+          <w:p>
+            <w:r/>
+            <w:r>
+              <w:rPr>
+                <w:sz w:val="17"/>
+              </w:rPr>
+              <w:t>1.07</w:t>
+            </w:r>
+          </w:p>
+        </w:tc>
+        <w:tc>
+          <w:tcPr>
+            <w:tcW w:type="dxa" w:w="2448"/>
+          </w:tcPr>
+          <w:p>
+            <w:r/>
+            <w:r>
+              <w:rPr>
+                <w:b/>
+                <w:color w:val="2E9E5B"/>
+                <w:sz w:val="17"/>
+              </w:rPr>
+              <w:t>3.06</w:t>
+            </w:r>
+          </w:p>
+        </w:tc>
+        <w:tc>
+          <w:tcPr>
+            <w:tcW w:type="dxa" w:w="1728"/>
+          </w:tcPr>
+          <w:p>
+            <w:r/>
+            <w:r>
+              <w:rPr>
+                <w:sz w:val="17"/>
+              </w:rPr>
+              <w:t>+1.99</w:t>
+            </w:r>
+          </w:p>
+        </w:tc>
+      </w:tr>
+      <w:tr>
+        <w:tc>
+          <w:tcPr>
+            <w:tcW w:type="dxa" w:w="3456"/>
+            <w:shd w:val="clear" w:fill="EEF3FA"/>
+          </w:tcPr>
+          <w:p>
+            <w:r/>
+            <w:r>
+              <w:rPr>
+                <w:sz w:val="17"/>
+              </w:rPr>
+              <w:t>OOS 2026, &gt;=5%</w:t>
+            </w:r>
+          </w:p>
+        </w:tc>
+        <w:tc>
+          <w:tcPr>
+            <w:tcW w:type="dxa" w:w="2448"/>
+            <w:shd w:val="clear" w:fill="EEF3FA"/>
+          </w:tcPr>
+          <w:p>
+            <w:r/>
+            <w:r>
+              <w:rPr>
+                <w:sz w:val="17"/>
+              </w:rPr>
+              <w:t>0.87</w:t>
+            </w:r>
+          </w:p>
+        </w:tc>
+        <w:tc>
+          <w:tcPr>
+            <w:tcW w:type="dxa" w:w="2448"/>
+            <w:shd w:val="clear" w:fill="EEF3FA"/>
+          </w:tcPr>
+          <w:p>
+            <w:r/>
+            <w:r>
+              <w:rPr>
+                <w:b/>
+                <w:color w:val="2E9E5B"/>
+                <w:sz w:val="17"/>
+              </w:rPr>
+              <w:t>1.55</w:t>
+            </w:r>
+          </w:p>
+        </w:tc>
+        <w:tc>
+          <w:tcPr>
+            <w:tcW w:type="dxa" w:w="1728"/>
+            <w:shd w:val="clear" w:fill="EEF3FA"/>
+          </w:tcPr>
+          <w:p>
+            <w:r/>
+            <w:r>
+              <w:rPr>
+                <w:sz w:val="17"/>
+              </w:rPr>
+              <w:t>+0.68</w:t>
+            </w:r>
+          </w:p>
+        </w:tc>
+      </w:tr>
+      <w:tr>
+        <w:tc>
+          <w:tcPr>
+            <w:tcW w:type="dxa" w:w="3456"/>
+          </w:tcPr>
+          <w:p>
+            <w:r/>
+            <w:r>
+              <w:rPr>
+                <w:sz w:val="17"/>
+              </w:rPr>
+              <w:t>OOS 2026, &gt;=10%</w:t>
+            </w:r>
+          </w:p>
+        </w:tc>
+        <w:tc>
+          <w:tcPr>
+            <w:tcW w:type="dxa" w:w="2448"/>
+          </w:tcPr>
+          <w:p>
+            <w:r/>
+            <w:r>
+              <w:rPr>
+                <w:sz w:val="17"/>
+              </w:rPr>
+              <w:t>0.88</w:t>
+            </w:r>
+          </w:p>
+        </w:tc>
+        <w:tc>
+          <w:tcPr>
+            <w:tcW w:type="dxa" w:w="2448"/>
+          </w:tcPr>
+          <w:p>
+            <w:r/>
+            <w:r>
+              <w:rPr>
+                <w:b/>
+                <w:color w:val="2E9E5B"/>
+                <w:sz w:val="17"/>
+              </w:rPr>
+              <w:t>1.84</w:t>
+            </w:r>
+          </w:p>
+        </w:tc>
+        <w:tc>
+          <w:tcPr>
+            <w:tcW w:type="dxa" w:w="1728"/>
+          </w:tcPr>
+          <w:p>
+            <w:r/>
+            <w:r>
+              <w:rPr>
+                <w:sz w:val="17"/>
+              </w:rPr>
+              <w:t>+0.96</w:t>
+            </w:r>
+          </w:p>
+        </w:tc>
+      </w:tr>
+      <w:tr>
+        <w:tc>
+          <w:tcPr>
+            <w:tcW w:type="dxa" w:w="3456"/>
+            <w:shd w:val="clear" w:fill="EEF3FA"/>
+          </w:tcPr>
+          <w:p>
+            <w:r/>
+            <w:r>
+              <w:rPr>
+                <w:sz w:val="17"/>
+              </w:rPr>
+              <w:t>En iyi %10 (tum), &gt;=10%</w:t>
+            </w:r>
+          </w:p>
+        </w:tc>
+        <w:tc>
+          <w:tcPr>
+            <w:tcW w:type="dxa" w:w="2448"/>
+            <w:shd w:val="clear" w:fill="EEF3FA"/>
+          </w:tcPr>
+          <w:p>
+            <w:r/>
+            <w:r>
+              <w:rPr>
+                <w:sz w:val="17"/>
+              </w:rPr>
+              <w:t>1.16</w:t>
+            </w:r>
+          </w:p>
+        </w:tc>
+        <w:tc>
+          <w:tcPr>
+            <w:tcW w:type="dxa" w:w="2448"/>
+            <w:shd w:val="clear" w:fill="EEF3FA"/>
+          </w:tcPr>
+          <w:p>
+            <w:r/>
+            <w:r>
+              <w:rPr>
+                <w:b/>
+                <w:color w:val="2E9E5B"/>
+                <w:sz w:val="17"/>
+              </w:rPr>
+              <w:t>2.52</w:t>
+            </w:r>
+          </w:p>
+        </w:tc>
+        <w:tc>
+          <w:tcPr>
+            <w:tcW w:type="dxa" w:w="1728"/>
+            <w:shd w:val="clear" w:fill="EEF3FA"/>
+          </w:tcPr>
+          <w:p>
+            <w:r/>
+            <w:r>
+              <w:rPr>
+                <w:sz w:val="17"/>
+              </w:rPr>
+              <w:t>+1.36</w:t>
+            </w:r>
+          </w:p>
+        </w:tc>
+      </w:tr>
+    </w:tbl>
+    <w:p>
+      <w:pPr>
+        <w:spacing w:after="40"/>
+      </w:pPr>
+    </w:p>
+    <w:p>
+      <w:pPr>
+        <w:jc w:val="center"/>
+      </w:pPr>
+      <w:r>
+        <w:drawing>
+          <wp:inline xmlns:a="http://schemas.openxmlformats.org/drawingml/2006/main" xmlns:pic="http://schemas.openxmlformats.org/drawingml/2006/picture">
+            <wp:extent cx="6035040" cy="2776118"/>
+            <wp:docPr id="14" name="Picture 14"/>
+            <wp:cNvGraphicFramePr>
+              <a:graphicFrameLocks noChangeAspect="1"/>
+            </wp:cNvGraphicFramePr>
+            <a:graphic>
+              <a:graphicData uri="http://schemas.openxmlformats.org/drawingml/2006/picture">
+                <pic:pic>
+                  <pic:nvPicPr>
+                    <pic:cNvPr id="0" name="fig_beforeafter.png"/>
+                    <pic:cNvPicPr/>
+                  </pic:nvPicPr>
+                  <pic:blipFill>
+                    <a:blip r:embed="rId22"/>
+                    <a:stretch>
+                      <a:fillRect/>
+                    </a:stretch>
+                  </pic:blipFill>
+                  <pic:spPr>
+                    <a:xfrm>
+                      <a:off x="0" y="0"/>
+                      <a:ext cx="6035040" cy="2776118"/>
+                    </a:xfrm>
+                    <a:prstGeom prst="rect"/>
+                  </pic:spPr>
+                </pic:pic>
+              </a:graphicData>
+            </a:graphic>
+          </wp:inline>
+        </w:drawing>
+      </w:r>
+    </w:p>
+    <w:p>
+      <w:pPr>
+        <w:jc w:val="center"/>
+      </w:pPr>
+      <w:r>
+        <w:rPr>
+          <w:i/>
+          <w:color w:val="606060"/>
+          <w:sz w:val="17"/>
+        </w:rPr>
+        <w:t>Sekil 14 — Yeni skor her donemde ve her esikte eski skoru yeniyor; ozellikle OOS'ta eski skor lift&lt;1.</w:t>
+      </w:r>
+    </w:p>
+    <w:p>
+      <w:pPr>
+        <w:spacing w:after="120"/>
+      </w:pPr>
+      <w:r>
+        <w:rPr>
+          <w:b/>
+          <w:i w:val="0"/>
+          <w:color w:val="2E9E5B"/>
+          <w:sz w:val="21"/>
+        </w:rPr>
+        <w:t>SONUC: Eski skor OOS'ta baz oranin ALTINDA (lift 0.87-0.88); yeni kompozit her donemde ustun ve OOS'ta gercek edge tasiyor (lift 1.55-1.84; en secici %10'da &gt;=10% icin 2.52). Reweight dogrulandi — ALPHA_V2'ye gecis kanitli. Bir sonraki (istege bagli) adim: short katkisini plato-sekline getiren minor ince ayar; ama mevcut agirliklar zaten her donemde net kazanc sagliyor.</w:t>
       </w:r>
     </w:p>
     <w:sectPr>

</xml_diff>